<commit_message>
New updated word document
</commit_message>
<xml_diff>
--- a/data/documents/EC2_Instance_creation.docx
+++ b/data/documents/EC2_Instance_creation.docx
@@ -112,7 +112,7 @@
           <w:szCs w:val="28"/>
         </w:rPr>
         <w:pict w14:anchorId="0EB99B44">
-          <v:rect id="_x0000_i1157" style="width:0;height:1.5pt" o:hralign="center" o:hrstd="t" o:hr="t" fillcolor="#a0a0a0" stroked="f"/>
+          <v:rect id="_x0000_i1025" style="width:0;height:1.5pt" o:hralign="center" o:hrstd="t" o:hr="t" fillcolor="#a0a0a0" stroked="f"/>
         </w:pict>
       </w:r>
     </w:p>
@@ -368,7 +368,7 @@
           <w:szCs w:val="28"/>
         </w:rPr>
         <w:pict w14:anchorId="0186435E">
-          <v:rect id="_x0000_i1158" style="width:0;height:1.5pt" o:hralign="center" o:hrstd="t" o:hr="t" fillcolor="#a0a0a0" stroked="f"/>
+          <v:rect id="_x0000_i1026" style="width:0;height:1.5pt" o:hralign="center" o:hrstd="t" o:hr="t" fillcolor="#a0a0a0" stroked="f"/>
         </w:pict>
       </w:r>
     </w:p>
@@ -432,7 +432,7 @@
           <w:sz w:val="28"/>
           <w:szCs w:val="28"/>
         </w:rPr>
-        <w:t xml:space="preserve">Open </w:t>
+        <w:t xml:space="preserve">Login to the AWS management console. This link is given. </w:t>
       </w:r>
       <w:hyperlink r:id="rId5" w:history="1">
         <w:r>
@@ -451,7 +451,23 @@
           <w:sz w:val="28"/>
           <w:szCs w:val="28"/>
         </w:rPr>
-        <w:t xml:space="preserve"> , refer Image1</w:t>
+        <w:t xml:space="preserve"> ,</w:t>
+      </w:r>
+      <w:r>
+        <w:rPr>
+          <w:rFonts w:ascii="Calibri" w:hAnsi="Calibri" w:cs="Calibri"/>
+          <w:sz w:val="28"/>
+          <w:szCs w:val="28"/>
+        </w:rPr>
+        <w:t xml:space="preserve"> either you can use the IAM user access or you can use the root user email and password. Authenticate it if you have enabled any MFA.</w:t>
+      </w:r>
+      <w:r>
+        <w:rPr>
+          <w:rFonts w:ascii="Calibri" w:hAnsi="Calibri" w:cs="Calibri"/>
+          <w:sz w:val="28"/>
+          <w:szCs w:val="28"/>
+        </w:rPr>
+        <w:t xml:space="preserve"> refer Image1</w:t>
       </w:r>
     </w:p>
     <w:p>
@@ -466,6 +482,7 @@
       <w:r>
         <w:rPr>
           <w:rFonts w:ascii="Calibri" w:hAnsi="Calibri" w:cs="Calibri"/>
+          <w:noProof/>
           <w:sz w:val="28"/>
           <w:szCs w:val="28"/>
         </w:rPr>
@@ -536,96 +553,12 @@
     </w:p>
     <w:p>
       <w:pPr>
-        <w:numPr>
-          <w:ilvl w:val="0"/>
-          <w:numId w:val="2"/>
-        </w:numPr>
-        <w:rPr>
-          <w:rFonts w:ascii="Calibri" w:hAnsi="Calibri" w:cs="Calibri"/>
-          <w:sz w:val="28"/>
-          <w:szCs w:val="28"/>
-        </w:rPr>
-      </w:pPr>
-      <w:r>
-        <w:rPr>
-          <w:rFonts w:ascii="Calibri" w:hAnsi="Calibri" w:cs="Calibri"/>
-          <w:sz w:val="28"/>
-          <w:szCs w:val="28"/>
-        </w:rPr>
-        <w:t xml:space="preserve">Sign in using your </w:t>
-      </w:r>
-      <w:r>
-        <w:rPr>
-          <w:rFonts w:ascii="Calibri" w:hAnsi="Calibri" w:cs="Calibri"/>
-          <w:sz w:val="28"/>
-          <w:szCs w:val="28"/>
-        </w:rPr>
-        <w:t>IAM access or you can sign in with the root email address.</w:t>
-      </w:r>
-    </w:p>
-    <w:p>
-      <w:pPr>
-        <w:numPr>
-          <w:ilvl w:val="0"/>
-          <w:numId w:val="2"/>
-        </w:numPr>
-        <w:rPr>
-          <w:rFonts w:ascii="Calibri" w:hAnsi="Calibri" w:cs="Calibri"/>
-          <w:sz w:val="28"/>
-          <w:szCs w:val="28"/>
-        </w:rPr>
-      </w:pPr>
-      <w:r>
-        <w:rPr>
-          <w:rFonts w:ascii="Calibri" w:hAnsi="Calibri" w:cs="Calibri"/>
-          <w:sz w:val="28"/>
-          <w:szCs w:val="28"/>
-        </w:rPr>
-        <w:t xml:space="preserve">Select the </w:t>
-      </w:r>
-      <w:r>
-        <w:rPr>
-          <w:rFonts w:ascii="Calibri" w:hAnsi="Calibri" w:cs="Calibri"/>
-          <w:b/>
-          <w:bCs/>
-          <w:sz w:val="28"/>
-          <w:szCs w:val="28"/>
-        </w:rPr>
-        <w:t>region</w:t>
-      </w:r>
-      <w:r>
-        <w:rPr>
-          <w:rFonts w:ascii="Calibri" w:hAnsi="Calibri" w:cs="Calibri"/>
-          <w:sz w:val="28"/>
-          <w:szCs w:val="28"/>
-        </w:rPr>
-        <w:t xml:space="preserve"> (top-right corner), e.g., ap-south-1 (Mumbai)</w:t>
-      </w:r>
-    </w:p>
-    <w:p>
-      <w:pPr>
-        <w:rPr>
-          <w:rFonts w:ascii="Calibri" w:hAnsi="Calibri" w:cs="Calibri"/>
-          <w:sz w:val="28"/>
-          <w:szCs w:val="28"/>
-        </w:rPr>
-      </w:pPr>
-      <w:r>
-        <w:rPr>
-          <w:rFonts w:ascii="Segoe UI Emoji" w:hAnsi="Segoe UI Emoji" w:cs="Segoe UI Emoji"/>
-          <w:sz w:val="28"/>
-          <w:szCs w:val="28"/>
-        </w:rPr>
-        <w:t>✅</w:t>
-      </w:r>
-      <w:r>
-        <w:rPr>
-          <w:rFonts w:ascii="Calibri" w:hAnsi="Calibri" w:cs="Calibri"/>
-          <w:sz w:val="28"/>
-          <w:szCs w:val="28"/>
-        </w:rPr>
-        <w:t xml:space="preserve"> </w:t>
-      </w:r>
+        <w:rPr>
+          <w:rFonts w:ascii="Calibri" w:hAnsi="Calibri" w:cs="Calibri"/>
+          <w:sz w:val="28"/>
+          <w:szCs w:val="28"/>
+        </w:rPr>
+      </w:pPr>
       <w:r>
         <w:rPr>
           <w:rFonts w:ascii="Calibri" w:hAnsi="Calibri" w:cs="Calibri"/>
@@ -660,7 +593,7 @@
           <w:szCs w:val="28"/>
         </w:rPr>
         <w:pict w14:anchorId="16D32174">
-          <v:rect id="_x0000_i1159" style="width:0;height:1.5pt" o:hralign="center" o:hrstd="t" o:hr="t" fillcolor="#a0a0a0" stroked="f"/>
+          <v:rect id="_x0000_i1027" style="width:0;height:1.5pt" o:hralign="center" o:hrstd="t" o:hr="t" fillcolor="#a0a0a0" stroked="f"/>
         </w:pict>
       </w:r>
     </w:p>
@@ -736,6 +669,84 @@
     </w:p>
     <w:p>
       <w:pPr>
+        <w:numPr>
+          <w:ilvl w:val="0"/>
+          <w:numId w:val="3"/>
+        </w:numPr>
+        <w:rPr>
+          <w:rFonts w:ascii="Calibri" w:hAnsi="Calibri" w:cs="Calibri"/>
+          <w:sz w:val="28"/>
+          <w:szCs w:val="28"/>
+        </w:rPr>
+      </w:pPr>
+      <w:r>
+        <w:rPr>
+          <w:rFonts w:ascii="Calibri" w:hAnsi="Calibri" w:cs="Calibri"/>
+          <w:sz w:val="28"/>
+          <w:szCs w:val="28"/>
+        </w:rPr>
+        <w:t xml:space="preserve">Click on </w:t>
+      </w:r>
+      <w:r>
+        <w:rPr>
+          <w:rFonts w:ascii="Calibri" w:hAnsi="Calibri" w:cs="Calibri"/>
+          <w:b/>
+          <w:bCs/>
+          <w:sz w:val="28"/>
+          <w:szCs w:val="28"/>
+        </w:rPr>
+        <w:t>EC2</w:t>
+      </w:r>
+      <w:r>
+        <w:rPr>
+          <w:rFonts w:ascii="Calibri" w:hAnsi="Calibri" w:cs="Calibri"/>
+          <w:sz w:val="28"/>
+          <w:szCs w:val="28"/>
+        </w:rPr>
+        <w:t xml:space="preserve"> under </w:t>
+      </w:r>
+      <w:r>
+        <w:rPr>
+          <w:rFonts w:ascii="Calibri" w:hAnsi="Calibri" w:cs="Calibri"/>
+          <w:i/>
+          <w:iCs/>
+          <w:sz w:val="28"/>
+          <w:szCs w:val="28"/>
+        </w:rPr>
+        <w:t>Services</w:t>
+      </w:r>
+    </w:p>
+    <w:p>
+      <w:pPr>
+        <w:numPr>
+          <w:ilvl w:val="0"/>
+          <w:numId w:val="3"/>
+        </w:numPr>
+        <w:rPr>
+          <w:rFonts w:ascii="Calibri" w:hAnsi="Calibri" w:cs="Calibri"/>
+          <w:sz w:val="28"/>
+          <w:szCs w:val="28"/>
+        </w:rPr>
+      </w:pPr>
+      <w:r>
+        <w:rPr>
+          <w:rFonts w:ascii="Calibri" w:hAnsi="Calibri" w:cs="Calibri"/>
+          <w:sz w:val="28"/>
+          <w:szCs w:val="28"/>
+        </w:rPr>
+        <w:t>You will land on the EC2 Dashboard</w:t>
+      </w:r>
+      <w:r>
+        <w:rPr>
+          <w:rFonts w:ascii="Calibri" w:hAnsi="Calibri" w:cs="Calibri"/>
+          <w:sz w:val="28"/>
+          <w:szCs w:val="28"/>
+        </w:rPr>
+        <w:t>. Refer Image3</w:t>
+      </w:r>
+    </w:p>
+    <w:p>
+      <w:pPr>
         <w:ind w:left="720"/>
         <w:rPr>
           <w:rFonts w:ascii="Calibri" w:hAnsi="Calibri" w:cs="Calibri"/>
@@ -743,9 +754,30 @@
           <w:szCs w:val="28"/>
         </w:rPr>
       </w:pPr>
-      <w:r>
-        <w:rPr>
-          <w:rFonts w:ascii="Calibri" w:hAnsi="Calibri" w:cs="Calibri"/>
+    </w:p>
+    <w:p>
+      <w:pPr>
+        <w:ind w:left="720"/>
+        <w:rPr>
+          <w:rFonts w:ascii="Calibri" w:hAnsi="Calibri" w:cs="Calibri"/>
+          <w:sz w:val="28"/>
+          <w:szCs w:val="28"/>
+        </w:rPr>
+      </w:pPr>
+    </w:p>
+    <w:p>
+      <w:pPr>
+        <w:ind w:left="720"/>
+        <w:rPr>
+          <w:rFonts w:ascii="Calibri" w:hAnsi="Calibri" w:cs="Calibri"/>
+          <w:sz w:val="28"/>
+          <w:szCs w:val="28"/>
+        </w:rPr>
+      </w:pPr>
+      <w:r>
+        <w:rPr>
+          <w:rFonts w:ascii="Calibri" w:hAnsi="Calibri" w:cs="Calibri"/>
+          <w:noProof/>
           <w:sz w:val="28"/>
           <w:szCs w:val="28"/>
         </w:rPr>
@@ -810,109 +842,7 @@
           <w:sz w:val="16"/>
           <w:szCs w:val="16"/>
         </w:rPr>
-        <w:t xml:space="preserve">       </w:t>
-      </w:r>
-      <w:r>
-        <w:rPr>
-          <w:rFonts w:ascii="Calibri" w:hAnsi="Calibri" w:cs="Calibri"/>
-          <w:sz w:val="16"/>
-          <w:szCs w:val="16"/>
-        </w:rPr>
-        <w:t xml:space="preserve">                                                   </w:t>
-      </w:r>
-      <w:r>
-        <w:rPr>
-          <w:rFonts w:ascii="Calibri" w:hAnsi="Calibri" w:cs="Calibri"/>
-          <w:sz w:val="16"/>
-          <w:szCs w:val="16"/>
-        </w:rPr>
-        <w:t>Image</w:t>
-      </w:r>
-      <w:r>
-        <w:rPr>
-          <w:rFonts w:ascii="Calibri" w:hAnsi="Calibri" w:cs="Calibri"/>
-          <w:sz w:val="16"/>
-          <w:szCs w:val="16"/>
-        </w:rPr>
-        <w:t>2</w:t>
-      </w:r>
-    </w:p>
-    <w:p>
-      <w:pPr>
-        <w:numPr>
-          <w:ilvl w:val="0"/>
-          <w:numId w:val="3"/>
-        </w:numPr>
-        <w:rPr>
-          <w:rFonts w:ascii="Calibri" w:hAnsi="Calibri" w:cs="Calibri"/>
-          <w:sz w:val="28"/>
-          <w:szCs w:val="28"/>
-        </w:rPr>
-      </w:pPr>
-      <w:r>
-        <w:rPr>
-          <w:rFonts w:ascii="Calibri" w:hAnsi="Calibri" w:cs="Calibri"/>
-          <w:sz w:val="28"/>
-          <w:szCs w:val="28"/>
-        </w:rPr>
-        <w:t xml:space="preserve">Click on </w:t>
-      </w:r>
-      <w:r>
-        <w:rPr>
-          <w:rFonts w:ascii="Calibri" w:hAnsi="Calibri" w:cs="Calibri"/>
-          <w:b/>
-          <w:bCs/>
-          <w:sz w:val="28"/>
-          <w:szCs w:val="28"/>
-        </w:rPr>
-        <w:t>EC2</w:t>
-      </w:r>
-      <w:r>
-        <w:rPr>
-          <w:rFonts w:ascii="Calibri" w:hAnsi="Calibri" w:cs="Calibri"/>
-          <w:sz w:val="28"/>
-          <w:szCs w:val="28"/>
-        </w:rPr>
-        <w:t xml:space="preserve"> under </w:t>
-      </w:r>
-      <w:r>
-        <w:rPr>
-          <w:rFonts w:ascii="Calibri" w:hAnsi="Calibri" w:cs="Calibri"/>
-          <w:i/>
-          <w:iCs/>
-          <w:sz w:val="28"/>
-          <w:szCs w:val="28"/>
-        </w:rPr>
-        <w:t>Services</w:t>
-      </w:r>
-    </w:p>
-    <w:p>
-      <w:pPr>
-        <w:numPr>
-          <w:ilvl w:val="0"/>
-          <w:numId w:val="3"/>
-        </w:numPr>
-        <w:rPr>
-          <w:rFonts w:ascii="Calibri" w:hAnsi="Calibri" w:cs="Calibri"/>
-          <w:sz w:val="28"/>
-          <w:szCs w:val="28"/>
-        </w:rPr>
-      </w:pPr>
-      <w:r>
-        <w:rPr>
-          <w:rFonts w:ascii="Calibri" w:hAnsi="Calibri" w:cs="Calibri"/>
-          <w:sz w:val="28"/>
-          <w:szCs w:val="28"/>
-        </w:rPr>
-        <w:t>You will land on the EC2 Dashboard</w:t>
-      </w:r>
-      <w:r>
-        <w:rPr>
-          <w:rFonts w:ascii="Calibri" w:hAnsi="Calibri" w:cs="Calibri"/>
-          <w:sz w:val="28"/>
-          <w:szCs w:val="28"/>
-        </w:rPr>
-        <w:t>. Refer Image3</w:t>
+        <w:t xml:space="preserve">                                                          Image2</w:t>
       </w:r>
     </w:p>
     <w:p>
@@ -927,6 +857,7 @@
       <w:r>
         <w:rPr>
           <w:rFonts w:ascii="Calibri" w:hAnsi="Calibri" w:cs="Calibri"/>
+          <w:noProof/>
           <w:sz w:val="28"/>
           <w:szCs w:val="28"/>
         </w:rPr>
@@ -992,31 +923,7 @@
           <w:sz w:val="16"/>
           <w:szCs w:val="16"/>
         </w:rPr>
-        <w:t xml:space="preserve">                                                          </w:t>
-      </w:r>
-      <w:r>
-        <w:rPr>
-          <w:rFonts w:ascii="Calibri" w:hAnsi="Calibri" w:cs="Calibri"/>
-          <w:sz w:val="16"/>
-          <w:szCs w:val="16"/>
-        </w:rPr>
-        <w:t xml:space="preserve">           </w:t>
-      </w:r>
-      <w:r>
-        <w:rPr>
-          <w:rFonts w:ascii="Calibri" w:hAnsi="Calibri" w:cs="Calibri"/>
-          <w:sz w:val="16"/>
-          <w:szCs w:val="16"/>
-        </w:rPr>
-        <w:t>Image</w:t>
-      </w:r>
-      <w:r>
-        <w:rPr>
-          <w:rFonts w:ascii="Calibri" w:hAnsi="Calibri" w:cs="Calibri"/>
-          <w:sz w:val="16"/>
-          <w:szCs w:val="16"/>
-        </w:rPr>
-        <w:t>3</w:t>
+        <w:t xml:space="preserve">                                                                     Image3</w:t>
       </w:r>
     </w:p>
     <w:p>
@@ -1034,7 +941,7 @@
           <w:szCs w:val="28"/>
         </w:rPr>
         <w:pict w14:anchorId="3CB70A60">
-          <v:rect id="_x0000_i1160" style="width:0;height:1.5pt" o:hralign="center" o:hrstd="t" o:hr="t" fillcolor="#a0a0a0" stroked="f"/>
+          <v:rect id="_x0000_i1028" style="width:0;height:1.5pt" o:hralign="center" o:hrstd="t" o:hr="t" fillcolor="#a0a0a0" stroked="f"/>
         </w:pict>
       </w:r>
     </w:p>
@@ -1126,6 +1033,56 @@
     </w:p>
     <w:p>
       <w:pPr>
+        <w:numPr>
+          <w:ilvl w:val="0"/>
+          <w:numId w:val="4"/>
+        </w:numPr>
+        <w:rPr>
+          <w:rFonts w:ascii="Calibri" w:hAnsi="Calibri" w:cs="Calibri"/>
+          <w:sz w:val="28"/>
+          <w:szCs w:val="28"/>
+        </w:rPr>
+      </w:pPr>
+      <w:r>
+        <w:rPr>
+          <w:rFonts w:ascii="Calibri" w:hAnsi="Calibri" w:cs="Calibri"/>
+          <w:sz w:val="28"/>
+          <w:szCs w:val="28"/>
+        </w:rPr>
+        <w:t xml:space="preserve">Provide an </w:t>
+      </w:r>
+      <w:r>
+        <w:rPr>
+          <w:rFonts w:ascii="Calibri" w:hAnsi="Calibri" w:cs="Calibri"/>
+          <w:b/>
+          <w:bCs/>
+          <w:sz w:val="28"/>
+          <w:szCs w:val="28"/>
+        </w:rPr>
+        <w:t>Instance Name</w:t>
+      </w:r>
+      <w:r>
+        <w:rPr>
+          <w:rFonts w:ascii="Calibri" w:hAnsi="Calibri" w:cs="Calibri"/>
+          <w:b/>
+          <w:bCs/>
+          <w:sz w:val="28"/>
+          <w:szCs w:val="28"/>
+        </w:rPr>
+        <w:t>.</w:t>
+      </w:r>
+      <w:r>
+        <w:rPr>
+          <w:rFonts w:ascii="Calibri" w:hAnsi="Calibri" w:cs="Calibri"/>
+          <w:sz w:val="28"/>
+          <w:szCs w:val="28"/>
+        </w:rPr>
+        <w:br/>
+        <w:t>Example: My-First-EC2-Server</w:t>
+      </w:r>
+    </w:p>
+    <w:p>
+      <w:pPr>
         <w:ind w:left="720"/>
         <w:rPr>
           <w:rFonts w:ascii="Calibri" w:hAnsi="Calibri" w:cs="Calibri"/>
@@ -1136,6 +1093,7 @@
       <w:r>
         <w:rPr>
           <w:rFonts w:ascii="Calibri" w:hAnsi="Calibri" w:cs="Calibri"/>
+          <w:noProof/>
           <w:sz w:val="28"/>
           <w:szCs w:val="28"/>
         </w:rPr>
@@ -1200,147 +1158,264 @@
           <w:sz w:val="16"/>
           <w:szCs w:val="16"/>
         </w:rPr>
-        <w:t xml:space="preserve">                                                                     Image</w:t>
-      </w:r>
-      <w:r>
+        <w:t xml:space="preserve">                                                                     Image4</w:t>
+      </w:r>
+    </w:p>
+    <w:p>
+      <w:pPr>
+        <w:rPr>
+          <w:rFonts w:ascii="Calibri" w:hAnsi="Calibri" w:cs="Calibri"/>
+          <w:sz w:val="28"/>
+          <w:szCs w:val="28"/>
+        </w:rPr>
+      </w:pPr>
+      <w:r>
+        <w:rPr>
+          <w:rFonts w:ascii="Calibri" w:hAnsi="Calibri" w:cs="Calibri"/>
+          <w:sz w:val="28"/>
+          <w:szCs w:val="28"/>
+        </w:rPr>
+        <w:pict w14:anchorId="5515E2CC">
+          <v:rect id="_x0000_i1029" style="width:0;height:1.5pt" o:hralign="center" o:hrstd="t" o:hr="t" fillcolor="#a0a0a0" stroked="f"/>
+        </w:pict>
+      </w:r>
+    </w:p>
+    <w:p>
+      <w:pPr>
+        <w:rPr>
+          <w:rFonts w:ascii="Calibri" w:hAnsi="Calibri" w:cs="Calibri"/>
+          <w:b/>
+          <w:bCs/>
+          <w:sz w:val="28"/>
+          <w:szCs w:val="28"/>
+        </w:rPr>
+      </w:pPr>
+      <w:r>
+        <w:rPr>
+          <w:rFonts w:ascii="Calibri" w:hAnsi="Calibri" w:cs="Calibri"/>
+          <w:b/>
+          <w:bCs/>
+          <w:sz w:val="28"/>
+          <w:szCs w:val="28"/>
+        </w:rPr>
+        <w:t>Step 4: Choose an Amazon Machine Image (AMI)</w:t>
+      </w:r>
+    </w:p>
+    <w:p>
+      <w:pPr>
+        <w:rPr>
+          <w:rFonts w:ascii="Calibri" w:hAnsi="Calibri" w:cs="Calibri"/>
+          <w:sz w:val="28"/>
+          <w:szCs w:val="28"/>
+        </w:rPr>
+      </w:pPr>
+      <w:r>
+        <w:rPr>
+          <w:rFonts w:ascii="Calibri" w:hAnsi="Calibri" w:cs="Calibri"/>
+          <w:sz w:val="28"/>
+          <w:szCs w:val="28"/>
+        </w:rPr>
+        <w:t>Select an operating system image</w:t>
+      </w:r>
+      <w:r>
+        <w:rPr>
+          <w:rFonts w:ascii="Calibri" w:hAnsi="Calibri" w:cs="Calibri"/>
+          <w:sz w:val="28"/>
+          <w:szCs w:val="28"/>
+        </w:rPr>
+        <w:t xml:space="preserve"> for the list of options. Refer Image 5</w:t>
+      </w:r>
+    </w:p>
+    <w:p>
+      <w:pPr>
+        <w:rPr>
+          <w:rFonts w:ascii="Calibri" w:hAnsi="Calibri" w:cs="Calibri"/>
+          <w:sz w:val="28"/>
+          <w:szCs w:val="28"/>
+        </w:rPr>
+      </w:pPr>
+      <w:r>
+        <w:rPr>
+          <w:rFonts w:ascii="Calibri" w:hAnsi="Calibri" w:cs="Calibri"/>
+          <w:sz w:val="28"/>
+          <w:szCs w:val="28"/>
+        </w:rPr>
+        <w:t>Common options:</w:t>
+      </w:r>
+    </w:p>
+    <w:p>
+      <w:pPr>
+        <w:numPr>
+          <w:ilvl w:val="0"/>
+          <w:numId w:val="5"/>
+        </w:numPr>
+        <w:rPr>
+          <w:rFonts w:ascii="Calibri" w:hAnsi="Calibri" w:cs="Calibri"/>
+          <w:sz w:val="28"/>
+          <w:szCs w:val="28"/>
+        </w:rPr>
+      </w:pPr>
+      <w:r>
+        <w:rPr>
+          <w:rFonts w:ascii="Calibri" w:hAnsi="Calibri" w:cs="Calibri"/>
+          <w:sz w:val="28"/>
+          <w:szCs w:val="28"/>
+        </w:rPr>
+        <w:t>Amazon Linux 2023</w:t>
+      </w:r>
+    </w:p>
+    <w:p>
+      <w:pPr>
+        <w:numPr>
+          <w:ilvl w:val="0"/>
+          <w:numId w:val="5"/>
+        </w:numPr>
+        <w:rPr>
+          <w:rFonts w:ascii="Calibri" w:hAnsi="Calibri" w:cs="Calibri"/>
+          <w:sz w:val="28"/>
+          <w:szCs w:val="28"/>
+        </w:rPr>
+      </w:pPr>
+      <w:r>
+        <w:rPr>
+          <w:rFonts w:ascii="Calibri" w:hAnsi="Calibri" w:cs="Calibri"/>
+          <w:sz w:val="28"/>
+          <w:szCs w:val="28"/>
+        </w:rPr>
+        <w:t>Ubuntu Server 22.04 LTS</w:t>
+      </w:r>
+    </w:p>
+    <w:p>
+      <w:pPr>
+        <w:numPr>
+          <w:ilvl w:val="0"/>
+          <w:numId w:val="5"/>
+        </w:numPr>
+        <w:rPr>
+          <w:rFonts w:ascii="Calibri" w:hAnsi="Calibri" w:cs="Calibri"/>
+          <w:sz w:val="28"/>
+          <w:szCs w:val="28"/>
+        </w:rPr>
+      </w:pPr>
+      <w:r>
+        <w:rPr>
+          <w:rFonts w:ascii="Calibri" w:hAnsi="Calibri" w:cs="Calibri"/>
+          <w:sz w:val="28"/>
+          <w:szCs w:val="28"/>
+        </w:rPr>
+        <w:t>Red Hat Enterprise Linux</w:t>
+      </w:r>
+    </w:p>
+    <w:p>
+      <w:pPr>
+        <w:numPr>
+          <w:ilvl w:val="0"/>
+          <w:numId w:val="5"/>
+        </w:numPr>
+        <w:rPr>
+          <w:rFonts w:ascii="Calibri" w:hAnsi="Calibri" w:cs="Calibri"/>
+          <w:sz w:val="28"/>
+          <w:szCs w:val="28"/>
+        </w:rPr>
+      </w:pPr>
+      <w:r>
+        <w:rPr>
+          <w:rFonts w:ascii="Calibri" w:hAnsi="Calibri" w:cs="Calibri"/>
+          <w:sz w:val="28"/>
+          <w:szCs w:val="28"/>
+        </w:rPr>
+        <w:lastRenderedPageBreak/>
+        <w:t>Windows Server</w:t>
+      </w:r>
+    </w:p>
+    <w:p>
+      <w:pPr>
+        <w:rPr>
+          <w:rFonts w:ascii="Calibri" w:hAnsi="Calibri" w:cs="Calibri"/>
+          <w:sz w:val="28"/>
+          <w:szCs w:val="28"/>
+        </w:rPr>
+      </w:pPr>
+      <w:r>
+        <w:rPr>
+          <w:rFonts w:ascii="Calibri" w:hAnsi="Calibri" w:cs="Calibri"/>
+          <w:b/>
+          <w:bCs/>
+          <w:sz w:val="28"/>
+          <w:szCs w:val="28"/>
+        </w:rPr>
+        <w:t>Recommendation:</w:t>
+      </w:r>
+      <w:r>
+        <w:rPr>
+          <w:rFonts w:ascii="Calibri" w:hAnsi="Calibri" w:cs="Calibri"/>
+          <w:sz w:val="28"/>
+          <w:szCs w:val="28"/>
+        </w:rPr>
+        <w:br/>
+        <w:t xml:space="preserve">Use </w:t>
+      </w:r>
+      <w:r>
+        <w:rPr>
+          <w:rFonts w:ascii="Calibri" w:hAnsi="Calibri" w:cs="Calibri"/>
+          <w:b/>
+          <w:bCs/>
+          <w:sz w:val="28"/>
+          <w:szCs w:val="28"/>
+        </w:rPr>
+        <w:t>Amazon Linux</w:t>
+      </w:r>
+      <w:r>
+        <w:rPr>
+          <w:rFonts w:ascii="Calibri" w:hAnsi="Calibri" w:cs="Calibri"/>
+          <w:sz w:val="28"/>
+          <w:szCs w:val="28"/>
+        </w:rPr>
+        <w:t xml:space="preserve"> or </w:t>
+      </w:r>
+      <w:r>
+        <w:rPr>
+          <w:rFonts w:ascii="Calibri" w:hAnsi="Calibri" w:cs="Calibri"/>
+          <w:b/>
+          <w:bCs/>
+          <w:sz w:val="28"/>
+          <w:szCs w:val="28"/>
+        </w:rPr>
+        <w:t>Ubuntu</w:t>
+      </w:r>
+      <w:r>
+        <w:rPr>
+          <w:rFonts w:ascii="Calibri" w:hAnsi="Calibri" w:cs="Calibri"/>
+          <w:sz w:val="28"/>
+          <w:szCs w:val="28"/>
+        </w:rPr>
+        <w:t xml:space="preserve"> for cost-effective and widely supported setups.</w:t>
+      </w:r>
+    </w:p>
+    <w:p>
+      <w:pPr>
+        <w:rPr>
+          <w:rFonts w:ascii="Calibri" w:hAnsi="Calibri" w:cs="Calibri"/>
+          <w:sz w:val="28"/>
+          <w:szCs w:val="28"/>
+        </w:rPr>
+      </w:pPr>
+    </w:p>
+    <w:p>
+      <w:pPr>
         <w:rPr>
           <w:rFonts w:ascii="Calibri" w:hAnsi="Calibri" w:cs="Calibri"/>
           <w:sz w:val="16"/>
           <w:szCs w:val="16"/>
         </w:rPr>
-        <w:t>4</w:t>
-      </w:r>
-    </w:p>
-    <w:p>
-      <w:pPr>
-        <w:numPr>
-          <w:ilvl w:val="0"/>
-          <w:numId w:val="4"/>
-        </w:numPr>
-        <w:rPr>
-          <w:rFonts w:ascii="Calibri" w:hAnsi="Calibri" w:cs="Calibri"/>
-          <w:sz w:val="28"/>
-          <w:szCs w:val="28"/>
-        </w:rPr>
-      </w:pPr>
-      <w:r>
-        <w:rPr>
-          <w:rFonts w:ascii="Calibri" w:hAnsi="Calibri" w:cs="Calibri"/>
-          <w:sz w:val="28"/>
-          <w:szCs w:val="28"/>
-        </w:rPr>
-        <w:t xml:space="preserve">Provide an </w:t>
-      </w:r>
-      <w:r>
-        <w:rPr>
-          <w:rFonts w:ascii="Calibri" w:hAnsi="Calibri" w:cs="Calibri"/>
-          <w:b/>
-          <w:bCs/>
-          <w:sz w:val="28"/>
-          <w:szCs w:val="28"/>
-        </w:rPr>
-        <w:t>Instance Name</w:t>
-      </w:r>
-      <w:r>
-        <w:rPr>
-          <w:rFonts w:ascii="Calibri" w:hAnsi="Calibri" w:cs="Calibri"/>
-          <w:b/>
-          <w:bCs/>
-          <w:sz w:val="28"/>
-          <w:szCs w:val="28"/>
-        </w:rPr>
-        <w:t>.</w:t>
-      </w:r>
-      <w:r>
-        <w:rPr>
-          <w:rFonts w:ascii="Calibri" w:hAnsi="Calibri" w:cs="Calibri"/>
-          <w:sz w:val="28"/>
-          <w:szCs w:val="28"/>
-        </w:rPr>
-        <w:br/>
-        <w:t>Example: My-First-EC2-Server</w:t>
-      </w:r>
-    </w:p>
-    <w:p>
-      <w:pPr>
-        <w:rPr>
-          <w:rFonts w:ascii="Calibri" w:hAnsi="Calibri" w:cs="Calibri"/>
-          <w:sz w:val="28"/>
-          <w:szCs w:val="28"/>
-        </w:rPr>
-      </w:pPr>
-      <w:r>
-        <w:rPr>
-          <w:rFonts w:ascii="Calibri" w:hAnsi="Calibri" w:cs="Calibri"/>
-          <w:sz w:val="28"/>
-          <w:szCs w:val="28"/>
-        </w:rPr>
-        <w:pict w14:anchorId="5515E2CC">
-          <v:rect id="_x0000_i1161" style="width:0;height:1.5pt" o:hralign="center" o:hrstd="t" o:hr="t" fillcolor="#a0a0a0" stroked="f"/>
-        </w:pict>
-      </w:r>
-    </w:p>
-    <w:p>
-      <w:pPr>
-        <w:rPr>
-          <w:rFonts w:ascii="Calibri" w:hAnsi="Calibri" w:cs="Calibri"/>
-          <w:b/>
-          <w:bCs/>
-          <w:sz w:val="28"/>
-          <w:szCs w:val="28"/>
-        </w:rPr>
-      </w:pPr>
-      <w:r>
-        <w:rPr>
-          <w:rFonts w:ascii="Calibri" w:hAnsi="Calibri" w:cs="Calibri"/>
-          <w:b/>
-          <w:bCs/>
-          <w:sz w:val="28"/>
-          <w:szCs w:val="28"/>
-        </w:rPr>
-        <w:t>Step 4: Choose an Amazon Machine Image (AMI)</w:t>
-      </w:r>
-    </w:p>
-    <w:p>
-      <w:pPr>
-        <w:rPr>
-          <w:rFonts w:ascii="Calibri" w:hAnsi="Calibri" w:cs="Calibri"/>
-          <w:sz w:val="28"/>
-          <w:szCs w:val="28"/>
-        </w:rPr>
-      </w:pPr>
-      <w:r>
-        <w:rPr>
-          <w:rFonts w:ascii="Calibri" w:hAnsi="Calibri" w:cs="Calibri"/>
-          <w:sz w:val="28"/>
-          <w:szCs w:val="28"/>
-        </w:rPr>
-        <w:t>Select an operating system image</w:t>
-      </w:r>
-      <w:r>
-        <w:rPr>
-          <w:rFonts w:ascii="Calibri" w:hAnsi="Calibri" w:cs="Calibri"/>
-          <w:sz w:val="28"/>
-          <w:szCs w:val="28"/>
-        </w:rPr>
-        <w:t xml:space="preserve"> for the list of options. Refer Image 5</w:t>
-      </w:r>
-    </w:p>
-    <w:p>
-      <w:pPr>
-        <w:rPr>
-          <w:rFonts w:ascii="Calibri" w:hAnsi="Calibri" w:cs="Calibri"/>
-          <w:sz w:val="16"/>
-          <w:szCs w:val="16"/>
-        </w:rPr>
-      </w:pPr>
-      <w:r>
-        <w:rPr>
-          <w:rFonts w:ascii="Calibri" w:hAnsi="Calibri" w:cs="Calibri"/>
-          <w:sz w:val="28"/>
-          <w:szCs w:val="28"/>
-        </w:rPr>
-        <w:lastRenderedPageBreak/>
+      </w:pPr>
+      <w:r>
+        <w:rPr>
+          <w:rFonts w:ascii="Calibri" w:hAnsi="Calibri" w:cs="Calibri"/>
+          <w:noProof/>
+          <w:sz w:val="28"/>
+          <w:szCs w:val="28"/>
+        </w:rPr>
         <w:drawing>
           <wp:inline distT="0" distB="0" distL="0" distR="0" wp14:anchorId="121698B2" wp14:editId="1A2D2FDB">
             <wp:extent cx="4953000" cy="2202017"/>
@@ -1456,120 +1531,65 @@
       <w:pPr>
         <w:rPr>
           <w:rFonts w:ascii="Calibri" w:hAnsi="Calibri" w:cs="Calibri"/>
-          <w:sz w:val="28"/>
-          <w:szCs w:val="28"/>
-        </w:rPr>
-      </w:pPr>
-      <w:r>
-        <w:rPr>
-          <w:rFonts w:ascii="Calibri" w:hAnsi="Calibri" w:cs="Calibri"/>
-          <w:sz w:val="28"/>
-          <w:szCs w:val="28"/>
-        </w:rPr>
-        <w:t>Common options:</w:t>
-      </w:r>
-    </w:p>
-    <w:p>
-      <w:pPr>
-        <w:numPr>
-          <w:ilvl w:val="0"/>
-          <w:numId w:val="5"/>
-        </w:numPr>
-        <w:rPr>
-          <w:rFonts w:ascii="Calibri" w:hAnsi="Calibri" w:cs="Calibri"/>
-          <w:sz w:val="28"/>
-          <w:szCs w:val="28"/>
-        </w:rPr>
-      </w:pPr>
-      <w:r>
-        <w:rPr>
-          <w:rFonts w:ascii="Calibri" w:hAnsi="Calibri" w:cs="Calibri"/>
-          <w:sz w:val="28"/>
-          <w:szCs w:val="28"/>
-        </w:rPr>
-        <w:t>Amazon Linux 2023</w:t>
-      </w:r>
-    </w:p>
-    <w:p>
-      <w:pPr>
-        <w:numPr>
-          <w:ilvl w:val="0"/>
-          <w:numId w:val="5"/>
-        </w:numPr>
-        <w:rPr>
-          <w:rFonts w:ascii="Calibri" w:hAnsi="Calibri" w:cs="Calibri"/>
-          <w:sz w:val="28"/>
-          <w:szCs w:val="28"/>
-        </w:rPr>
-      </w:pPr>
-      <w:r>
-        <w:rPr>
-          <w:rFonts w:ascii="Calibri" w:hAnsi="Calibri" w:cs="Calibri"/>
-          <w:sz w:val="28"/>
-          <w:szCs w:val="28"/>
-        </w:rPr>
-        <w:t>Ubuntu Server 22.04 LTS</w:t>
-      </w:r>
-    </w:p>
-    <w:p>
-      <w:pPr>
-        <w:numPr>
-          <w:ilvl w:val="0"/>
-          <w:numId w:val="5"/>
-        </w:numPr>
-        <w:rPr>
-          <w:rFonts w:ascii="Calibri" w:hAnsi="Calibri" w:cs="Calibri"/>
-          <w:sz w:val="28"/>
-          <w:szCs w:val="28"/>
-        </w:rPr>
-      </w:pPr>
-      <w:r>
-        <w:rPr>
-          <w:rFonts w:ascii="Calibri" w:hAnsi="Calibri" w:cs="Calibri"/>
-          <w:sz w:val="28"/>
-          <w:szCs w:val="28"/>
-        </w:rPr>
-        <w:t>Red Hat Enterprise Linux</w:t>
-      </w:r>
-    </w:p>
-    <w:p>
-      <w:pPr>
-        <w:numPr>
-          <w:ilvl w:val="0"/>
-          <w:numId w:val="5"/>
-        </w:numPr>
-        <w:rPr>
-          <w:rFonts w:ascii="Calibri" w:hAnsi="Calibri" w:cs="Calibri"/>
-          <w:sz w:val="28"/>
-          <w:szCs w:val="28"/>
-        </w:rPr>
-      </w:pPr>
-      <w:r>
-        <w:rPr>
-          <w:rFonts w:ascii="Calibri" w:hAnsi="Calibri" w:cs="Calibri"/>
-          <w:sz w:val="28"/>
-          <w:szCs w:val="28"/>
-        </w:rPr>
-        <w:t>Windows Server</w:t>
-      </w:r>
-    </w:p>
-    <w:p>
-      <w:pPr>
-        <w:rPr>
-          <w:rFonts w:ascii="Calibri" w:hAnsi="Calibri" w:cs="Calibri"/>
-          <w:sz w:val="28"/>
-          <w:szCs w:val="28"/>
-        </w:rPr>
-      </w:pPr>
-      <w:r>
-        <w:rPr>
-          <w:rFonts w:ascii="Calibri" w:hAnsi="Calibri" w:cs="Calibri"/>
-          <w:b/>
-          <w:bCs/>
-          <w:sz w:val="28"/>
-          <w:szCs w:val="28"/>
-        </w:rPr>
-        <w:t>Recommendation:</w:t>
+          <w:b/>
+          <w:bCs/>
+          <w:sz w:val="28"/>
+          <w:szCs w:val="28"/>
+        </w:rPr>
+      </w:pPr>
+      <w:r>
+        <w:rPr>
+          <w:rFonts w:ascii="Calibri" w:hAnsi="Calibri" w:cs="Calibri"/>
+          <w:b/>
+          <w:bCs/>
+          <w:sz w:val="28"/>
+          <w:szCs w:val="28"/>
+        </w:rPr>
+        <w:t>Step 5: Choose an Instance Type</w:t>
+      </w:r>
+    </w:p>
+    <w:p>
+      <w:pPr>
+        <w:rPr>
+          <w:rFonts w:ascii="Calibri" w:hAnsi="Calibri" w:cs="Calibri"/>
+          <w:sz w:val="28"/>
+          <w:szCs w:val="28"/>
+        </w:rPr>
+      </w:pPr>
+      <w:r>
+        <w:rPr>
+          <w:rFonts w:ascii="Calibri" w:hAnsi="Calibri" w:cs="Calibri"/>
+          <w:sz w:val="28"/>
+          <w:szCs w:val="28"/>
+        </w:rPr>
+        <w:t>Select the instance size based on workload</w:t>
+      </w:r>
+      <w:r>
+        <w:rPr>
+          <w:rFonts w:ascii="Calibri" w:hAnsi="Calibri" w:cs="Calibri"/>
+          <w:sz w:val="28"/>
+          <w:szCs w:val="28"/>
+        </w:rPr>
+        <w:t>. Refer Image 6</w:t>
+      </w:r>
+    </w:p>
+    <w:p>
+      <w:pPr>
+        <w:rPr>
+          <w:rFonts w:ascii="Calibri" w:hAnsi="Calibri" w:cs="Calibri"/>
+          <w:sz w:val="28"/>
+          <w:szCs w:val="28"/>
+        </w:rPr>
+      </w:pPr>
+      <w:r>
+        <w:rPr>
+          <w:rFonts w:ascii="Calibri" w:hAnsi="Calibri" w:cs="Calibri"/>
+          <w:b/>
+          <w:bCs/>
+          <w:sz w:val="28"/>
+          <w:szCs w:val="28"/>
+        </w:rPr>
+        <w:t>Free Tier:</w:t>
       </w:r>
       <w:r>
         <w:rPr>
@@ -1578,121 +1598,40 @@
           <w:szCs w:val="28"/>
         </w:rPr>
         <w:br/>
-        <w:t xml:space="preserve">Use </w:t>
-      </w:r>
-      <w:r>
-        <w:rPr>
-          <w:rFonts w:ascii="Calibri" w:hAnsi="Calibri" w:cs="Calibri"/>
-          <w:b/>
-          <w:bCs/>
-          <w:sz w:val="28"/>
-          <w:szCs w:val="28"/>
-        </w:rPr>
-        <w:t>Amazon Linux</w:t>
-      </w:r>
-      <w:r>
-        <w:rPr>
-          <w:rFonts w:ascii="Calibri" w:hAnsi="Calibri" w:cs="Calibri"/>
-          <w:sz w:val="28"/>
-          <w:szCs w:val="28"/>
-        </w:rPr>
-        <w:t xml:space="preserve"> or </w:t>
-      </w:r>
-      <w:r>
-        <w:rPr>
-          <w:rFonts w:ascii="Calibri" w:hAnsi="Calibri" w:cs="Calibri"/>
-          <w:b/>
-          <w:bCs/>
-          <w:sz w:val="28"/>
-          <w:szCs w:val="28"/>
-        </w:rPr>
-        <w:t>Ubuntu</w:t>
-      </w:r>
-      <w:r>
-        <w:rPr>
-          <w:rFonts w:ascii="Calibri" w:hAnsi="Calibri" w:cs="Calibri"/>
-          <w:sz w:val="28"/>
-          <w:szCs w:val="28"/>
-        </w:rPr>
-        <w:t xml:space="preserve"> for cost-effective and widely supported setups.</w:t>
-      </w:r>
-    </w:p>
-    <w:p>
-      <w:pPr>
-        <w:rPr>
-          <w:rFonts w:ascii="Calibri" w:hAnsi="Calibri" w:cs="Calibri"/>
-          <w:sz w:val="28"/>
-          <w:szCs w:val="28"/>
-        </w:rPr>
-      </w:pPr>
-      <w:r>
-        <w:rPr>
-          <w:rFonts w:ascii="Calibri" w:hAnsi="Calibri" w:cs="Calibri"/>
-          <w:sz w:val="28"/>
-          <w:szCs w:val="28"/>
-        </w:rPr>
-        <w:pict w14:anchorId="43AA8D11">
-          <v:rect id="_x0000_i1162" style="width:0;height:1.5pt" o:hralign="center" o:hrstd="t" o:hr="t" fillcolor="#a0a0a0" stroked="f"/>
-        </w:pict>
-      </w:r>
-    </w:p>
-    <w:p>
-      <w:pPr>
-        <w:rPr>
-          <w:rFonts w:ascii="Calibri" w:hAnsi="Calibri" w:cs="Calibri"/>
-          <w:b/>
-          <w:bCs/>
-          <w:sz w:val="28"/>
-          <w:szCs w:val="28"/>
-        </w:rPr>
-      </w:pPr>
-      <w:r>
-        <w:rPr>
-          <w:rFonts w:ascii="Calibri" w:hAnsi="Calibri" w:cs="Calibri"/>
-          <w:b/>
-          <w:bCs/>
-          <w:sz w:val="28"/>
-          <w:szCs w:val="28"/>
-        </w:rPr>
-        <w:t>Step 5: Choose an Instance Type</w:t>
-      </w:r>
-    </w:p>
-    <w:p>
-      <w:pPr>
-        <w:rPr>
-          <w:rFonts w:ascii="Calibri" w:hAnsi="Calibri" w:cs="Calibri"/>
-          <w:sz w:val="28"/>
-          <w:szCs w:val="28"/>
-        </w:rPr>
-      </w:pPr>
-      <w:r>
-        <w:rPr>
-          <w:rFonts w:ascii="Calibri" w:hAnsi="Calibri" w:cs="Calibri"/>
-          <w:sz w:val="28"/>
-          <w:szCs w:val="28"/>
-        </w:rPr>
-        <w:t>Select the instance size based on workload</w:t>
-      </w:r>
-      <w:r>
-        <w:rPr>
-          <w:rFonts w:ascii="Calibri" w:hAnsi="Calibri" w:cs="Calibri"/>
-          <w:sz w:val="28"/>
-          <w:szCs w:val="28"/>
-        </w:rPr>
-        <w:t>. Refer Image 6</w:t>
-      </w:r>
-    </w:p>
-    <w:p>
-      <w:pPr>
-        <w:rPr>
-          <w:rFonts w:ascii="Calibri" w:hAnsi="Calibri" w:cs="Calibri"/>
-          <w:sz w:val="28"/>
-          <w:szCs w:val="28"/>
-        </w:rPr>
-      </w:pPr>
-      <w:r>
-        <w:rPr>
-          <w:rFonts w:ascii="Calibri" w:hAnsi="Calibri" w:cs="Calibri"/>
+        <w:t>t2.micro or t</w:t>
+      </w:r>
+      <w:proofErr w:type="gramStart"/>
+      <w:r>
+        <w:rPr>
+          <w:rFonts w:ascii="Calibri" w:hAnsi="Calibri" w:cs="Calibri"/>
+          <w:sz w:val="28"/>
+          <w:szCs w:val="28"/>
+        </w:rPr>
+        <w:t>3.micro</w:t>
+      </w:r>
+      <w:proofErr w:type="gramEnd"/>
+    </w:p>
+    <w:p>
+      <w:pPr>
+        <w:rPr>
+          <w:rFonts w:ascii="Calibri" w:hAnsi="Calibri" w:cs="Calibri"/>
+          <w:sz w:val="28"/>
+          <w:szCs w:val="28"/>
+        </w:rPr>
+      </w:pPr>
+    </w:p>
+    <w:p>
+      <w:pPr>
+        <w:rPr>
+          <w:rFonts w:ascii="Calibri" w:hAnsi="Calibri" w:cs="Calibri"/>
+          <w:sz w:val="28"/>
+          <w:szCs w:val="28"/>
+        </w:rPr>
+      </w:pPr>
+      <w:r>
+        <w:rPr>
+          <w:rFonts w:ascii="Calibri" w:hAnsi="Calibri" w:cs="Calibri"/>
+          <w:noProof/>
           <w:sz w:val="28"/>
           <w:szCs w:val="28"/>
         </w:rPr>
@@ -1819,75 +1758,47 @@
       <w:r>
         <w:rPr>
           <w:rFonts w:ascii="Calibri" w:hAnsi="Calibri" w:cs="Calibri"/>
-          <w:b/>
-          <w:bCs/>
+          <w:sz w:val="28"/>
+          <w:szCs w:val="28"/>
+        </w:rPr>
+        <w:t xml:space="preserve">Click </w:t>
+      </w:r>
+      <w:r>
+        <w:rPr>
+          <w:rFonts w:ascii="Calibri" w:hAnsi="Calibri" w:cs="Calibri"/>
+          <w:b/>
+          <w:bCs/>
+          <w:sz w:val="28"/>
+          <w:szCs w:val="28"/>
+        </w:rPr>
+        <w:t>Next</w:t>
+      </w:r>
+      <w:r>
+        <w:rPr>
+          <w:rFonts w:ascii="Calibri" w:hAnsi="Calibri" w:cs="Calibri"/>
+          <w:sz w:val="28"/>
+          <w:szCs w:val="28"/>
+        </w:rPr>
+        <w:t xml:space="preserve"> or continue scrolling.</w:t>
+      </w:r>
+    </w:p>
+    <w:p>
+      <w:pPr>
+        <w:rPr>
+          <w:rFonts w:ascii="Calibri" w:hAnsi="Calibri" w:cs="Calibri"/>
+          <w:sz w:val="28"/>
+          <w:szCs w:val="28"/>
+        </w:rPr>
+      </w:pPr>
+      <w:r>
+        <w:rPr>
+          <w:rFonts w:ascii="Calibri" w:hAnsi="Calibri" w:cs="Calibri"/>
           <w:sz w:val="28"/>
           <w:szCs w:val="28"/>
         </w:rPr>
         <w:lastRenderedPageBreak/>
-        <w:t>Free Tier:</w:t>
-      </w:r>
-      <w:r>
-        <w:rPr>
-          <w:rFonts w:ascii="Calibri" w:hAnsi="Calibri" w:cs="Calibri"/>
-          <w:sz w:val="28"/>
-          <w:szCs w:val="28"/>
-        </w:rPr>
-        <w:br/>
-        <w:t>t2.micro or t3.micro</w:t>
-      </w:r>
-    </w:p>
-    <w:p>
-      <w:pPr>
-        <w:rPr>
-          <w:rFonts w:ascii="Calibri" w:hAnsi="Calibri" w:cs="Calibri"/>
-          <w:sz w:val="28"/>
-          <w:szCs w:val="28"/>
-        </w:rPr>
-      </w:pPr>
-      <w:r>
-        <w:rPr>
-          <w:rFonts w:ascii="Calibri" w:hAnsi="Calibri" w:cs="Calibri"/>
-          <w:sz w:val="28"/>
-          <w:szCs w:val="28"/>
-        </w:rPr>
-        <w:t xml:space="preserve">Click </w:t>
-      </w:r>
-      <w:r>
-        <w:rPr>
-          <w:rFonts w:ascii="Calibri" w:hAnsi="Calibri" w:cs="Calibri"/>
-          <w:b/>
-          <w:bCs/>
-          <w:sz w:val="28"/>
-          <w:szCs w:val="28"/>
-        </w:rPr>
-        <w:t>Next</w:t>
-      </w:r>
-      <w:r>
-        <w:rPr>
-          <w:rFonts w:ascii="Calibri" w:hAnsi="Calibri" w:cs="Calibri"/>
-          <w:sz w:val="28"/>
-          <w:szCs w:val="28"/>
-        </w:rPr>
-        <w:t xml:space="preserve"> or continue scrolling.</w:t>
-      </w:r>
-    </w:p>
-    <w:p>
-      <w:pPr>
-        <w:rPr>
-          <w:rFonts w:ascii="Calibri" w:hAnsi="Calibri" w:cs="Calibri"/>
-          <w:sz w:val="28"/>
-          <w:szCs w:val="28"/>
-        </w:rPr>
-      </w:pPr>
-      <w:r>
-        <w:rPr>
-          <w:rFonts w:ascii="Calibri" w:hAnsi="Calibri" w:cs="Calibri"/>
-          <w:sz w:val="28"/>
-          <w:szCs w:val="28"/>
-        </w:rPr>
         <w:pict w14:anchorId="00F2A0AB">
-          <v:rect id="_x0000_i1163" style="width:0;height:1.5pt" o:hralign="center" o:hrstd="t" o:hr="t" fillcolor="#a0a0a0" stroked="f"/>
+          <v:rect id="_x0000_i1031" style="width:0;height:1.5pt" o:hralign="center" o:hrstd="t" o:hr="t" fillcolor="#a0a0a0" stroked="f"/>
         </w:pict>
       </w:r>
     </w:p>
@@ -2120,6 +2031,7 @@
       <w:r>
         <w:rPr>
           <w:rFonts w:ascii="Calibri" w:hAnsi="Calibri" w:cs="Calibri"/>
+          <w:noProof/>
           <w:sz w:val="28"/>
           <w:szCs w:val="28"/>
         </w:rPr>
@@ -2241,7 +2153,7 @@
           <w:szCs w:val="28"/>
         </w:rPr>
         <w:pict w14:anchorId="770A6B47">
-          <v:rect id="_x0000_i1164" style="width:0;height:1.5pt" o:hralign="center" o:hrstd="t" o:hr="t" fillcolor="#a0a0a0" stroked="f"/>
+          <v:rect id="_x0000_i1032" style="width:0;height:1.5pt" o:hralign="center" o:hrstd="t" o:hr="t" fillcolor="#a0a0a0" stroked="f"/>
         </w:pict>
       </w:r>
     </w:p>
@@ -2469,6 +2381,7 @@
       <w:r>
         <w:rPr>
           <w:rFonts w:ascii="Calibri" w:hAnsi="Calibri" w:cs="Calibri"/>
+          <w:noProof/>
           <w:sz w:val="28"/>
           <w:szCs w:val="28"/>
         </w:rPr>
@@ -2591,7 +2504,7 @@
           <w:szCs w:val="28"/>
         </w:rPr>
         <w:pict w14:anchorId="65C2749C">
-          <v:rect id="_x0000_i1165" style="width:0;height:1.5pt" o:hralign="center" o:hrstd="t" o:hr="t" fillcolor="#a0a0a0" stroked="f"/>
+          <v:rect id="_x0000_i1033" style="width:0;height:1.5pt" o:hralign="center" o:hrstd="t" o:hr="t" fillcolor="#a0a0a0" stroked="f"/>
         </w:pict>
       </w:r>
     </w:p>
@@ -2801,7 +2714,7 @@
           <w:szCs w:val="28"/>
         </w:rPr>
         <w:pict w14:anchorId="5A72CB09">
-          <v:rect id="_x0000_i1167" style="width:0;height:1.5pt" o:hralign="center" o:hrstd="t" o:hr="t" fillcolor="#a0a0a0" stroked="f"/>
+          <v:rect id="_x0000_i1034" style="width:0;height:1.5pt" o:hralign="center" o:hrstd="t" o:hr="t" fillcolor="#a0a0a0" stroked="f"/>
         </w:pict>
       </w:r>
     </w:p>
@@ -4899,6 +4812,7 @@
   <w:style w:type="character" w:default="1" w:styleId="DefaultParagraphFont">
     <w:name w:val="Default Paragraph Font"/>
     <w:uiPriority w:val="1"/>
+    <w:semiHidden/>
     <w:unhideWhenUsed/>
   </w:style>
   <w:style w:type="table" w:default="1" w:styleId="TableNormal">

</xml_diff>